<commit_message>
Add smoke test harness and fix manuscript render bugs
scripts/smoke_test.sh runs env checks (uv sync, renv status, quarto),
renders the book/manuscript/revealjs projects, and scans rendered output
for unresolved cross-references.

Real bugs found by the harness and fixed:

- reticulate was missing; python chunks in the manuscript failed.
  Installed into the system R library (subdir renders do not activate
  the renv project library) and recorded in renv.lock.
- myproject/_quarto.yml had fullwidth yen (U+00A5) instead of backslash
  in header-includes LaTeX -> Missing \begin{document}.
- bibliography: ../citation/references.bib escaped the typst project
  root; now uses a local copy (same pattern as output/references.bib).
- lualatex pdf and typst outputs both produced index.pdf and collided
  during the final move; pdf now uses output-file: index-lualatex.

Generated with [Devin](https://devin.ai)

Co-Authored-By: Devin <158243242+devin-ai-integration[bot]@users.noreply.github.com>
</commit_message>
<xml_diff>
--- a/myproject/_manuscript/index.docx
+++ b/myproject/_manuscript/index.docx
@@ -50,6 +50,32 @@
         <w:t xml:space="preserve">This is a demo of quarto manuscript</w:t>
       </w:r>
     </w:p>
+    <w:sdt>
+      <w:sdtPr>
+        <w:docPartObj>
+          <w:docPartGallery w:val="Table of Contents"/>
+          <w:docPartUnique/>
+        </w:docPartObj>
+      </w:sdtPr>
+      <w:sdtContent>
+        <w:p>
+          <w:pPr>
+            <w:pStyle w:val="TOCHeading"/>
+          </w:pPr>
+          <w:r>
+            <w:t xml:space="preserve">Table of contents</w:t>
+          </w:r>
+        </w:p>
+        <w:p>
+          <w:r>
+            <w:fldChar w:fldCharType="begin" w:dirty="true"/>
+            <w:instrText xml:space="preserve">TOC \o "1-2" \h \z \u</w:instrText>
+            <w:fldChar w:fldCharType="separate"/>
+            <w:fldChar w:fldCharType="end"/>
+          </w:r>
+        </w:p>
+      </w:sdtContent>
+    </w:sdt>
     <w:bookmarkStart w:id="10" w:name="numpy"/>
     <w:p>
       <w:pPr>
@@ -676,7 +702,7 @@
         <w:rFonts w:asciiTheme="minorHAnsi" w:cstheme="minorBidi" w:eastAsiaTheme="minorEastAsia" w:hAnsiTheme="minorHAnsi"/>
         <w:sz w:val="24"/>
         <w:szCs w:val="24"/>
-        <w:lang w:bidi="ar-SA" w:eastAsia="zh-CN" w:val="en-US"/>
+        <w:lang w:bidi="ar-SA" w:eastAsia="zh-CN" w:val="en"/>
       </w:rPr>
     </w:rPrDefault>
     <w:pPrDefault>

</xml_diff>